<commit_message>
oh my miserable mind
</commit_message>
<xml_diff>
--- a/4 семестр/ТСПП/курсовик/ПЗ.docx
+++ b/4 семестр/ТСПП/курсовик/ПЗ.docx
@@ -1727,18 +1727,8 @@
                 <w:szCs w:val="28"/>
                 <w:lang w:bidi="en-US"/>
               </w:rPr>
-              <w:t xml:space="preserve">Защита       </w:t>
-            </w:r>
-            <w:proofErr w:type="gramStart"/>
-            <w:r>
-              <w:rPr>
-                <w:rFonts w:eastAsia="Times New Roman" w:cs="Times New Roman"/>
-                <w:szCs w:val="28"/>
-                <w:lang w:bidi="en-US"/>
-              </w:rPr>
-              <w:t xml:space="preserve">   «</w:t>
-            </w:r>
-            <w:proofErr w:type="gramEnd"/>
+              <w:t>Защита          «</w:t>
+            </w:r>
           </w:p>
         </w:tc>
         <w:tc>
@@ -5862,13 +5852,7 @@
     </w:p>
     <w:p>
       <w:r>
-        <w:t>Основной каркас программы был описан ранее в диаграмме классов (р</w:t>
-      </w:r>
-      <w:r>
-        <w:t>исунок 1.2</w:t>
-      </w:r>
-      <w:r>
-        <w:t>). Однако диаграмма – лишь способ отобразить сложные процессы реального мира в виде объектов и их взаимодействий. Поэтому итоговая реализация претерпела изменения.</w:t>
+        <w:t>Основной каркас программы был описан ранее в диаграмме классов (рисунок 1.2). Однако диаграмма – лишь способ отобразить сложные процессы реального мира в виде объектов и их взаимодействий. Поэтому итоговая реализация претерпела изменения.</w:t>
       </w:r>
     </w:p>
     <w:p>
@@ -6144,7 +6128,10 @@
         <w:rPr>
           <w:lang w:val="en-US"/>
         </w:rPr>
-        <w:t>PIN-</w:t>
+        <w:t>PIN</w:t>
+      </w:r>
+      <w:r>
+        <w:t>-</w:t>
       </w:r>
       <w:r>
         <w:t>кода) и предлагает различные операции.</w:t>
@@ -6201,7 +6188,517 @@
       <w:r>
         <w:t>Тестирование и отладка</w:t>
       </w:r>
-    </w:p>
+      <w:r>
+        <w:t xml:space="preserve"> (</w:t>
+      </w:r>
+      <w:r>
+        <w:t>работа клиента)</w:t>
+      </w:r>
+    </w:p>
+    <w:p/>
+    <w:p>
+      <w:r>
+        <w:t>С началом работы в системе появляется список с доступными для работы пользователями (рисунок 2.4.1). Выбираем пользователя с ролью клиент – номер 1.</w:t>
+      </w:r>
+    </w:p>
+    <w:p/>
+    <w:p>
+      <w:pPr>
+        <w:ind w:firstLine="0"/>
+        <w:jc w:val="center"/>
+      </w:pPr>
+      <w:r>
+        <w:rPr>
+          <w:noProof/>
+        </w:rPr>
+        <w:drawing>
+          <wp:inline distT="0" distB="0" distL="0" distR="0" wp14:anchorId="6BE2856E" wp14:editId="5F107894">
+            <wp:extent cx="2540000" cy="1629782"/>
+            <wp:effectExtent l="0" t="0" r="0" b="8890"/>
+            <wp:docPr id="20302632" name="Рисунок 1"/>
+            <wp:cNvGraphicFramePr>
+              <a:graphicFrameLocks xmlns:a="http://schemas.openxmlformats.org/drawingml/2006/main" noChangeAspect="1"/>
+            </wp:cNvGraphicFramePr>
+            <a:graphic xmlns:a="http://schemas.openxmlformats.org/drawingml/2006/main">
+              <a:graphicData uri="http://schemas.openxmlformats.org/drawingml/2006/picture">
+                <pic:pic xmlns:pic="http://schemas.openxmlformats.org/drawingml/2006/picture">
+                  <pic:nvPicPr>
+                    <pic:cNvPr id="20302632" name=""/>
+                    <pic:cNvPicPr/>
+                  </pic:nvPicPr>
+                  <pic:blipFill>
+                    <a:blip r:embed="rId18"/>
+                    <a:stretch>
+                      <a:fillRect/>
+                    </a:stretch>
+                  </pic:blipFill>
+                  <pic:spPr>
+                    <a:xfrm>
+                      <a:off x="0" y="0"/>
+                      <a:ext cx="2549643" cy="1635969"/>
+                    </a:xfrm>
+                    <a:prstGeom prst="rect">
+                      <a:avLst/>
+                    </a:prstGeom>
+                  </pic:spPr>
+                </pic:pic>
+              </a:graphicData>
+            </a:graphic>
+          </wp:inline>
+        </w:drawing>
+      </w:r>
+    </w:p>
+    <w:p>
+      <w:pPr>
+        <w:ind w:firstLine="0"/>
+        <w:jc w:val="center"/>
+      </w:pPr>
+      <w:r>
+        <w:t>Рисунок 2.4.1 – Выбор пользователя</w:t>
+      </w:r>
+    </w:p>
+    <w:p/>
+    <w:p>
+      <w:r>
+        <w:t>У клиентов есть список банковских карт. После выбора клиентов этот список отображается с нумерацией, позволяя выбрать карту для работы (рисунок 2.4.2).</w:t>
+      </w:r>
+    </w:p>
+    <w:p/>
+    <w:p>
+      <w:pPr>
+        <w:ind w:firstLine="0"/>
+        <w:jc w:val="center"/>
+      </w:pPr>
+      <w:r>
+        <w:rPr>
+          <w:noProof/>
+        </w:rPr>
+        <w:drawing>
+          <wp:inline distT="0" distB="0" distL="0" distR="0" wp14:anchorId="2EAC08B7" wp14:editId="13585F6B">
+            <wp:extent cx="2641600" cy="1235280"/>
+            <wp:effectExtent l="0" t="0" r="6350" b="3175"/>
+            <wp:docPr id="87668449" name="Рисунок 1"/>
+            <wp:cNvGraphicFramePr>
+              <a:graphicFrameLocks xmlns:a="http://schemas.openxmlformats.org/drawingml/2006/main" noChangeAspect="1"/>
+            </wp:cNvGraphicFramePr>
+            <a:graphic xmlns:a="http://schemas.openxmlformats.org/drawingml/2006/main">
+              <a:graphicData uri="http://schemas.openxmlformats.org/drawingml/2006/picture">
+                <pic:pic xmlns:pic="http://schemas.openxmlformats.org/drawingml/2006/picture">
+                  <pic:nvPicPr>
+                    <pic:cNvPr id="87668449" name=""/>
+                    <pic:cNvPicPr/>
+                  </pic:nvPicPr>
+                  <pic:blipFill>
+                    <a:blip r:embed="rId19"/>
+                    <a:stretch>
+                      <a:fillRect/>
+                    </a:stretch>
+                  </pic:blipFill>
+                  <pic:spPr>
+                    <a:xfrm>
+                      <a:off x="0" y="0"/>
+                      <a:ext cx="2657750" cy="1242832"/>
+                    </a:xfrm>
+                    <a:prstGeom prst="rect">
+                      <a:avLst/>
+                    </a:prstGeom>
+                  </pic:spPr>
+                </pic:pic>
+              </a:graphicData>
+            </a:graphic>
+          </wp:inline>
+        </w:drawing>
+      </w:r>
+    </w:p>
+    <w:p>
+      <w:pPr>
+        <w:ind w:firstLine="0"/>
+        <w:jc w:val="center"/>
+      </w:pPr>
+      <w:r>
+        <w:t>Рисунок 2.4.2 – Выбор банковской карты</w:t>
+      </w:r>
+    </w:p>
+    <w:p/>
+    <w:p>
+      <w:r>
+        <w:lastRenderedPageBreak/>
+        <w:t xml:space="preserve">Автоматически начинается сеанс обслуживания клиента одним заранее созданным банкоматом. Выводится названия банка, стандартная информация о карте, после чего клиенту предлагается подтвердить </w:t>
+      </w:r>
+      <w:r>
+        <w:rPr>
+          <w:lang w:val="en-US"/>
+        </w:rPr>
+        <w:t>PIN</w:t>
+      </w:r>
+      <w:r>
+        <w:t>-</w:t>
+      </w:r>
+      <w:r>
+        <w:t>код. Если это не удаётся за три попытки – карта блокируется и возвращается клиенту (рисунок 2.4.3).</w:t>
+      </w:r>
+    </w:p>
+    <w:p/>
+    <w:p>
+      <w:pPr>
+        <w:ind w:firstLine="0"/>
+        <w:jc w:val="center"/>
+      </w:pPr>
+      <w:r>
+        <w:rPr>
+          <w:noProof/>
+        </w:rPr>
+        <w:drawing>
+          <wp:inline distT="0" distB="0" distL="0" distR="0" wp14:anchorId="146E8487" wp14:editId="0AB37332">
+            <wp:extent cx="2266950" cy="2943501"/>
+            <wp:effectExtent l="0" t="0" r="0" b="9525"/>
+            <wp:docPr id="681551944" name="Рисунок 1"/>
+            <wp:cNvGraphicFramePr>
+              <a:graphicFrameLocks xmlns:a="http://schemas.openxmlformats.org/drawingml/2006/main" noChangeAspect="1"/>
+            </wp:cNvGraphicFramePr>
+            <a:graphic xmlns:a="http://schemas.openxmlformats.org/drawingml/2006/main">
+              <a:graphicData uri="http://schemas.openxmlformats.org/drawingml/2006/picture">
+                <pic:pic xmlns:pic="http://schemas.openxmlformats.org/drawingml/2006/picture">
+                  <pic:nvPicPr>
+                    <pic:cNvPr id="681551944" name=""/>
+                    <pic:cNvPicPr/>
+                  </pic:nvPicPr>
+                  <pic:blipFill>
+                    <a:blip r:embed="rId20"/>
+                    <a:stretch>
+                      <a:fillRect/>
+                    </a:stretch>
+                  </pic:blipFill>
+                  <pic:spPr>
+                    <a:xfrm>
+                      <a:off x="0" y="0"/>
+                      <a:ext cx="2287540" cy="2970236"/>
+                    </a:xfrm>
+                    <a:prstGeom prst="rect">
+                      <a:avLst/>
+                    </a:prstGeom>
+                  </pic:spPr>
+                </pic:pic>
+              </a:graphicData>
+            </a:graphic>
+          </wp:inline>
+        </w:drawing>
+      </w:r>
+    </w:p>
+    <w:p>
+      <w:pPr>
+        <w:ind w:firstLine="0"/>
+        <w:jc w:val="center"/>
+      </w:pPr>
+      <w:r>
+        <w:t xml:space="preserve">Рисунок 2.4.3 </w:t>
+      </w:r>
+      <w:r>
+        <w:t>–</w:t>
+      </w:r>
+      <w:r>
+        <w:t xml:space="preserve"> </w:t>
+      </w:r>
+      <w:r>
+        <w:t>Безуспешная валидация карты</w:t>
+      </w:r>
+    </w:p>
+    <w:p/>
+    <w:p>
+      <w:r>
+        <w:t>Заблокированную карту нельзя попытаться использовать ещё раз – банкомат считает статус блокировки и откажет в обслуживании (рисунок 2.4.4).</w:t>
+      </w:r>
+    </w:p>
+    <w:p/>
+    <w:p>
+      <w:pPr>
+        <w:ind w:firstLine="0"/>
+        <w:jc w:val="center"/>
+      </w:pPr>
+      <w:r>
+        <w:rPr>
+          <w:noProof/>
+        </w:rPr>
+        <w:drawing>
+          <wp:inline distT="0" distB="0" distL="0" distR="0" wp14:anchorId="29DCC7FF" wp14:editId="05B0617F">
+            <wp:extent cx="2484700" cy="1752600"/>
+            <wp:effectExtent l="0" t="0" r="0" b="0"/>
+            <wp:docPr id="1221969981" name="Рисунок 1"/>
+            <wp:cNvGraphicFramePr>
+              <a:graphicFrameLocks xmlns:a="http://schemas.openxmlformats.org/drawingml/2006/main" noChangeAspect="1"/>
+            </wp:cNvGraphicFramePr>
+            <a:graphic xmlns:a="http://schemas.openxmlformats.org/drawingml/2006/main">
+              <a:graphicData uri="http://schemas.openxmlformats.org/drawingml/2006/picture">
+                <pic:pic xmlns:pic="http://schemas.openxmlformats.org/drawingml/2006/picture">
+                  <pic:nvPicPr>
+                    <pic:cNvPr id="1221969981" name=""/>
+                    <pic:cNvPicPr/>
+                  </pic:nvPicPr>
+                  <pic:blipFill>
+                    <a:blip r:embed="rId21"/>
+                    <a:stretch>
+                      <a:fillRect/>
+                    </a:stretch>
+                  </pic:blipFill>
+                  <pic:spPr>
+                    <a:xfrm>
+                      <a:off x="0" y="0"/>
+                      <a:ext cx="2502657" cy="1765266"/>
+                    </a:xfrm>
+                    <a:prstGeom prst="rect">
+                      <a:avLst/>
+                    </a:prstGeom>
+                  </pic:spPr>
+                </pic:pic>
+              </a:graphicData>
+            </a:graphic>
+          </wp:inline>
+        </w:drawing>
+      </w:r>
+    </w:p>
+    <w:p>
+      <w:pPr>
+        <w:ind w:firstLine="0"/>
+        <w:jc w:val="center"/>
+      </w:pPr>
+      <w:r>
+        <w:t>Рисунок 2.4.4 – Попытка работы с заблокированной картой</w:t>
+      </w:r>
+    </w:p>
+    <w:p>
+      <w:pPr>
+        <w:ind w:firstLine="0"/>
+        <w:jc w:val="center"/>
+      </w:pPr>
+    </w:p>
+    <w:p>
+      <w:r>
+        <w:lastRenderedPageBreak/>
+        <w:t>Если же валидация удалась пользователю становятся доступны три стандартные операции: вывод баланса, пополнение счёта и снятие наличных (рисунок 2.4.5).</w:t>
+      </w:r>
+    </w:p>
+    <w:p/>
+    <w:p>
+      <w:pPr>
+        <w:ind w:firstLine="0"/>
+        <w:jc w:val="center"/>
+      </w:pPr>
+      <w:r>
+        <w:rPr>
+          <w:noProof/>
+        </w:rPr>
+        <w:drawing>
+          <wp:inline distT="0" distB="0" distL="0" distR="0" wp14:anchorId="19077EA7" wp14:editId="164493A4">
+            <wp:extent cx="3022600" cy="1987463"/>
+            <wp:effectExtent l="0" t="0" r="6350" b="0"/>
+            <wp:docPr id="943028932" name="Рисунок 1"/>
+            <wp:cNvGraphicFramePr>
+              <a:graphicFrameLocks xmlns:a="http://schemas.openxmlformats.org/drawingml/2006/main" noChangeAspect="1"/>
+            </wp:cNvGraphicFramePr>
+            <a:graphic xmlns:a="http://schemas.openxmlformats.org/drawingml/2006/main">
+              <a:graphicData uri="http://schemas.openxmlformats.org/drawingml/2006/picture">
+                <pic:pic xmlns:pic="http://schemas.openxmlformats.org/drawingml/2006/picture">
+                  <pic:nvPicPr>
+                    <pic:cNvPr id="943028932" name=""/>
+                    <pic:cNvPicPr/>
+                  </pic:nvPicPr>
+                  <pic:blipFill>
+                    <a:blip r:embed="rId22"/>
+                    <a:stretch>
+                      <a:fillRect/>
+                    </a:stretch>
+                  </pic:blipFill>
+                  <pic:spPr>
+                    <a:xfrm>
+                      <a:off x="0" y="0"/>
+                      <a:ext cx="3036802" cy="1996802"/>
+                    </a:xfrm>
+                    <a:prstGeom prst="rect">
+                      <a:avLst/>
+                    </a:prstGeom>
+                  </pic:spPr>
+                </pic:pic>
+              </a:graphicData>
+            </a:graphic>
+          </wp:inline>
+        </w:drawing>
+      </w:r>
+    </w:p>
+    <w:p>
+      <w:pPr>
+        <w:ind w:firstLine="0"/>
+        <w:jc w:val="center"/>
+      </w:pPr>
+      <w:r>
+        <w:t>Рисунок 2.4.5 – Успешная валидация и вывод баланса</w:t>
+      </w:r>
+    </w:p>
+    <w:p>
+      <w:pPr>
+        <w:ind w:firstLine="0"/>
+        <w:jc w:val="center"/>
+        <w:rPr>
+          <w:lang w:val="en-US"/>
+        </w:rPr>
+      </w:pPr>
+    </w:p>
+    <w:p>
+      <w:r>
+        <w:t>Для снятия наличных пользователь должен ввести в банкомат требуемую сумму. Учитывается множество факторов: может ли банкомат выдать нужное число купюр, достаточно ли на банковском счету денег</w:t>
+      </w:r>
+      <w:r>
+        <w:t>. Если всё корректно, то пользователь «забирает» из валидатора переданные купюры (рисунок 2.4.6).</w:t>
+      </w:r>
+    </w:p>
+    <w:p>
+      <w:pPr>
+        <w:ind w:firstLine="0"/>
+        <w:jc w:val="center"/>
+      </w:pPr>
+    </w:p>
+    <w:p>
+      <w:pPr>
+        <w:ind w:firstLine="0"/>
+        <w:jc w:val="center"/>
+      </w:pPr>
+      <w:r>
+        <w:rPr>
+          <w:noProof/>
+        </w:rPr>
+        <w:drawing>
+          <wp:inline distT="0" distB="0" distL="0" distR="0" wp14:anchorId="7D07C9A1" wp14:editId="74607FAF">
+            <wp:extent cx="3450277" cy="2565400"/>
+            <wp:effectExtent l="0" t="0" r="0" b="6350"/>
+            <wp:docPr id="658744147" name="Рисунок 1"/>
+            <wp:cNvGraphicFramePr>
+              <a:graphicFrameLocks xmlns:a="http://schemas.openxmlformats.org/drawingml/2006/main" noChangeAspect="1"/>
+            </wp:cNvGraphicFramePr>
+            <a:graphic xmlns:a="http://schemas.openxmlformats.org/drawingml/2006/main">
+              <a:graphicData uri="http://schemas.openxmlformats.org/drawingml/2006/picture">
+                <pic:pic xmlns:pic="http://schemas.openxmlformats.org/drawingml/2006/picture">
+                  <pic:nvPicPr>
+                    <pic:cNvPr id="658744147" name=""/>
+                    <pic:cNvPicPr/>
+                  </pic:nvPicPr>
+                  <pic:blipFill>
+                    <a:blip r:embed="rId23"/>
+                    <a:stretch>
+                      <a:fillRect/>
+                    </a:stretch>
+                  </pic:blipFill>
+                  <pic:spPr>
+                    <a:xfrm>
+                      <a:off x="0" y="0"/>
+                      <a:ext cx="3461930" cy="2574064"/>
+                    </a:xfrm>
+                    <a:prstGeom prst="rect">
+                      <a:avLst/>
+                    </a:prstGeom>
+                  </pic:spPr>
+                </pic:pic>
+              </a:graphicData>
+            </a:graphic>
+          </wp:inline>
+        </w:drawing>
+      </w:r>
+    </w:p>
+    <w:p>
+      <w:pPr>
+        <w:ind w:firstLine="0"/>
+        <w:jc w:val="center"/>
+      </w:pPr>
+      <w:r>
+        <w:t>Рисунок 2.4.6 – Снятие наличных</w:t>
+      </w:r>
+    </w:p>
+    <w:p/>
+    <w:p>
+      <w:r>
+        <w:lastRenderedPageBreak/>
+        <w:t>Внесение наличных проводится схожим образом. Клиент (в текущей реализации через ввод итоговой суммы) вносит в валидатор купюры, там они проверяются, пересчитываются и, в случае, если валидация прошла успешно и в кассе банкомата есть место, отправляются туда (рисунок 2.4.7). Банковский счёт пополняется на соответствующую сумму.</w:t>
+      </w:r>
+    </w:p>
+    <w:p/>
+    <w:p>
+      <w:pPr>
+        <w:ind w:firstLine="0"/>
+        <w:jc w:val="center"/>
+      </w:pPr>
+      <w:r>
+        <w:rPr>
+          <w:noProof/>
+        </w:rPr>
+        <w:drawing>
+          <wp:inline distT="0" distB="0" distL="0" distR="0" wp14:anchorId="2B2554C5" wp14:editId="7045E65E">
+            <wp:extent cx="3048000" cy="1955691"/>
+            <wp:effectExtent l="0" t="0" r="0" b="6985"/>
+            <wp:docPr id="1218481584" name="Рисунок 1"/>
+            <wp:cNvGraphicFramePr>
+              <a:graphicFrameLocks xmlns:a="http://schemas.openxmlformats.org/drawingml/2006/main" noChangeAspect="1"/>
+            </wp:cNvGraphicFramePr>
+            <a:graphic xmlns:a="http://schemas.openxmlformats.org/drawingml/2006/main">
+              <a:graphicData uri="http://schemas.openxmlformats.org/drawingml/2006/picture">
+                <pic:pic xmlns:pic="http://schemas.openxmlformats.org/drawingml/2006/picture">
+                  <pic:nvPicPr>
+                    <pic:cNvPr id="1218481584" name=""/>
+                    <pic:cNvPicPr/>
+                  </pic:nvPicPr>
+                  <pic:blipFill>
+                    <a:blip r:embed="rId24"/>
+                    <a:stretch>
+                      <a:fillRect/>
+                    </a:stretch>
+                  </pic:blipFill>
+                  <pic:spPr>
+                    <a:xfrm>
+                      <a:off x="0" y="0"/>
+                      <a:ext cx="3056403" cy="1961082"/>
+                    </a:xfrm>
+                    <a:prstGeom prst="rect">
+                      <a:avLst/>
+                    </a:prstGeom>
+                  </pic:spPr>
+                </pic:pic>
+              </a:graphicData>
+            </a:graphic>
+          </wp:inline>
+        </w:drawing>
+      </w:r>
+    </w:p>
+    <w:p>
+      <w:pPr>
+        <w:ind w:firstLine="0"/>
+        <w:jc w:val="center"/>
+      </w:pPr>
+      <w:r>
+        <w:t>Рисунок 2.4.7 – Внесение наличных</w:t>
+      </w:r>
+    </w:p>
+    <w:p/>
+    <w:p>
+      <w:r>
+        <w:t>Операции можно выбирать сколь угодно долго. При выборе «операции 0» сеанс обслуживания завершается, а оператор программы возвращается к списку доступных пользователей.</w:t>
+      </w:r>
+    </w:p>
+    <w:p/>
+    <w:p/>
+    <w:p>
+      <w:pPr>
+        <w:pStyle w:val="2"/>
+        <w:numPr>
+          <w:ilvl w:val="0"/>
+          <w:numId w:val="19"/>
+        </w:numPr>
+        <w:tabs>
+          <w:tab w:val="left" w:pos="1276"/>
+        </w:tabs>
+        <w:ind w:left="0" w:firstLine="709"/>
+      </w:pPr>
+      <w:r>
+        <w:t xml:space="preserve"> Тестирование и отладка (работа инкассатора)</w:t>
+      </w:r>
+    </w:p>
+    <w:p/>
     <w:p>
       <w:pPr>
         <w:tabs>
@@ -6235,6 +6732,7 @@
         <w:ind w:firstLine="0"/>
       </w:pPr>
       <w:r>
+        <w:lastRenderedPageBreak/>
         <w:br w:type="page"/>
       </w:r>
     </w:p>
@@ -6493,10 +6991,10 @@
       </w:pPr>
     </w:p>
     <w:sectPr>
-      <w:headerReference w:type="default" r:id="rId18"/>
-      <w:footerReference w:type="default" r:id="rId19"/>
+      <w:headerReference w:type="default" r:id="rId25"/>
+      <w:footerReference w:type="default" r:id="rId26"/>
       <w:pgSz w:w="11906" w:h="16838"/>
-      <w:pgMar w:top="1134" w:right="850" w:bottom="1134" w:left="1701" w:header="708" w:footer="708" w:gutter="0"/>
+      <w:pgMar w:top="1134" w:right="851" w:bottom="1134" w:left="1701" w:header="709" w:footer="709" w:gutter="0"/>
       <w:pgNumType w:start="1"/>
       <w:cols w:space="708"/>
       <w:titlePg/>
@@ -7508,8 +8006,8 @@
   <w:abstractNum w:abstractNumId="9" w15:restartNumberingAfterBreak="0">
     <w:nsid w:val="2143310B"/>
     <w:multiLevelType w:val="hybridMultilevel"/>
-    <w:tmpl w:val="3A285822"/>
-    <w:lvl w:ilvl="0" w:tplc="30B8534E">
+    <w:tmpl w:val="EC424E6A"/>
+    <w:lvl w:ilvl="0" w:tplc="9E466EDC">
       <w:start w:val="1"/>
       <w:numFmt w:val="decimal"/>
       <w:lvlText w:val="2.%1"/>
@@ -7595,6 +8093,95 @@
     </w:lvl>
   </w:abstractNum>
   <w:abstractNum w:abstractNumId="10" w15:restartNumberingAfterBreak="0">
+    <w:nsid w:val="21D3461A"/>
+    <w:multiLevelType w:val="hybridMultilevel"/>
+    <w:tmpl w:val="1CA8B048"/>
+    <w:lvl w:ilvl="0" w:tplc="30B8534E">
+      <w:start w:val="1"/>
+      <w:numFmt w:val="decimal"/>
+      <w:lvlText w:val="2.%1"/>
+      <w:lvlJc w:val="left"/>
+      <w:pPr>
+        <w:ind w:left="1789" w:hanging="360"/>
+      </w:pPr>
+      <w:rPr>
+        <w:rFonts w:hint="default"/>
+      </w:rPr>
+    </w:lvl>
+    <w:lvl w:ilvl="1" w:tplc="04190019" w:tentative="1">
+      <w:start w:val="1"/>
+      <w:numFmt w:val="lowerLetter"/>
+      <w:lvlText w:val="%2."/>
+      <w:lvlJc w:val="left"/>
+      <w:pPr>
+        <w:ind w:left="2509" w:hanging="360"/>
+      </w:pPr>
+    </w:lvl>
+    <w:lvl w:ilvl="2" w:tplc="0419001B" w:tentative="1">
+      <w:start w:val="1"/>
+      <w:numFmt w:val="lowerRoman"/>
+      <w:lvlText w:val="%3."/>
+      <w:lvlJc w:val="right"/>
+      <w:pPr>
+        <w:ind w:left="3229" w:hanging="180"/>
+      </w:pPr>
+    </w:lvl>
+    <w:lvl w:ilvl="3" w:tplc="0419000F" w:tentative="1">
+      <w:start w:val="1"/>
+      <w:numFmt w:val="decimal"/>
+      <w:lvlText w:val="%4."/>
+      <w:lvlJc w:val="left"/>
+      <w:pPr>
+        <w:ind w:left="3949" w:hanging="360"/>
+      </w:pPr>
+    </w:lvl>
+    <w:lvl w:ilvl="4" w:tplc="04190019" w:tentative="1">
+      <w:start w:val="1"/>
+      <w:numFmt w:val="lowerLetter"/>
+      <w:lvlText w:val="%5."/>
+      <w:lvlJc w:val="left"/>
+      <w:pPr>
+        <w:ind w:left="4669" w:hanging="360"/>
+      </w:pPr>
+    </w:lvl>
+    <w:lvl w:ilvl="5" w:tplc="0419001B" w:tentative="1">
+      <w:start w:val="1"/>
+      <w:numFmt w:val="lowerRoman"/>
+      <w:lvlText w:val="%6."/>
+      <w:lvlJc w:val="right"/>
+      <w:pPr>
+        <w:ind w:left="5389" w:hanging="180"/>
+      </w:pPr>
+    </w:lvl>
+    <w:lvl w:ilvl="6" w:tplc="0419000F" w:tentative="1">
+      <w:start w:val="1"/>
+      <w:numFmt w:val="decimal"/>
+      <w:lvlText w:val="%7."/>
+      <w:lvlJc w:val="left"/>
+      <w:pPr>
+        <w:ind w:left="6109" w:hanging="360"/>
+      </w:pPr>
+    </w:lvl>
+    <w:lvl w:ilvl="7" w:tplc="04190019" w:tentative="1">
+      <w:start w:val="1"/>
+      <w:numFmt w:val="lowerLetter"/>
+      <w:lvlText w:val="%8."/>
+      <w:lvlJc w:val="left"/>
+      <w:pPr>
+        <w:ind w:left="6829" w:hanging="360"/>
+      </w:pPr>
+    </w:lvl>
+    <w:lvl w:ilvl="8" w:tplc="0419001B" w:tentative="1">
+      <w:start w:val="1"/>
+      <w:numFmt w:val="lowerRoman"/>
+      <w:lvlText w:val="%9."/>
+      <w:lvlJc w:val="right"/>
+      <w:pPr>
+        <w:ind w:left="7549" w:hanging="180"/>
+      </w:pPr>
+    </w:lvl>
+  </w:abstractNum>
+  <w:abstractNum w:abstractNumId="11" w15:restartNumberingAfterBreak="0">
     <w:nsid w:val="3D95391D"/>
     <w:multiLevelType w:val="hybridMultilevel"/>
     <w:tmpl w:val="7C5A0D6E"/>
@@ -7707,7 +8294,7 @@
       </w:rPr>
     </w:lvl>
   </w:abstractNum>
-  <w:abstractNum w:abstractNumId="11" w15:restartNumberingAfterBreak="0">
+  <w:abstractNum w:abstractNumId="12" w15:restartNumberingAfterBreak="0">
     <w:nsid w:val="495D4885"/>
     <w:multiLevelType w:val="hybridMultilevel"/>
     <w:tmpl w:val="8E3AC74E"/>
@@ -7793,7 +8380,7 @@
       </w:pPr>
     </w:lvl>
   </w:abstractNum>
-  <w:abstractNum w:abstractNumId="12" w15:restartNumberingAfterBreak="0">
+  <w:abstractNum w:abstractNumId="13" w15:restartNumberingAfterBreak="0">
     <w:nsid w:val="5AB642C8"/>
     <w:multiLevelType w:val="hybridMultilevel"/>
     <w:tmpl w:val="4CD0480C"/>
@@ -7882,7 +8469,7 @@
       </w:pPr>
     </w:lvl>
   </w:abstractNum>
-  <w:abstractNum w:abstractNumId="13" w15:restartNumberingAfterBreak="0">
+  <w:abstractNum w:abstractNumId="14" w15:restartNumberingAfterBreak="0">
     <w:nsid w:val="5C196B4C"/>
     <w:multiLevelType w:val="hybridMultilevel"/>
     <w:tmpl w:val="1C0AFA18"/>
@@ -7968,7 +8555,7 @@
       </w:pPr>
     </w:lvl>
   </w:abstractNum>
-  <w:abstractNum w:abstractNumId="14" w15:restartNumberingAfterBreak="0">
+  <w:abstractNum w:abstractNumId="15" w15:restartNumberingAfterBreak="0">
     <w:nsid w:val="5F852A07"/>
     <w:multiLevelType w:val="hybridMultilevel"/>
     <w:tmpl w:val="FA0E8B22"/>
@@ -8081,7 +8668,7 @@
       </w:rPr>
     </w:lvl>
   </w:abstractNum>
-  <w:abstractNum w:abstractNumId="15" w15:restartNumberingAfterBreak="0">
+  <w:abstractNum w:abstractNumId="16" w15:restartNumberingAfterBreak="0">
     <w:nsid w:val="74D14488"/>
     <w:multiLevelType w:val="hybridMultilevel"/>
     <w:tmpl w:val="CBE0D4C8"/>
@@ -8194,7 +8781,7 @@
       </w:rPr>
     </w:lvl>
   </w:abstractNum>
-  <w:abstractNum w:abstractNumId="16" w15:restartNumberingAfterBreak="0">
+  <w:abstractNum w:abstractNumId="17" w15:restartNumberingAfterBreak="0">
     <w:nsid w:val="74D72AA5"/>
     <w:multiLevelType w:val="hybridMultilevel"/>
     <w:tmpl w:val="486834C4"/>
@@ -8307,7 +8894,7 @@
       </w:rPr>
     </w:lvl>
   </w:abstractNum>
-  <w:abstractNum w:abstractNumId="17" w15:restartNumberingAfterBreak="0">
+  <w:abstractNum w:abstractNumId="18" w15:restartNumberingAfterBreak="0">
     <w:nsid w:val="7EF25CD4"/>
     <w:multiLevelType w:val="hybridMultilevel"/>
     <w:tmpl w:val="E75A10AA"/>
@@ -8420,7 +9007,96 @@
       </w:rPr>
     </w:lvl>
   </w:abstractNum>
-  <w:abstractNum w:abstractNumId="18" w15:restartNumberingAfterBreak="0">
+  <w:abstractNum w:abstractNumId="19" w15:restartNumberingAfterBreak="0">
+    <w:nsid w:val="7F81512A"/>
+    <w:multiLevelType w:val="hybridMultilevel"/>
+    <w:tmpl w:val="0ED8FBAA"/>
+    <w:lvl w:ilvl="0" w:tplc="30B8534E">
+      <w:start w:val="1"/>
+      <w:numFmt w:val="decimal"/>
+      <w:lvlText w:val="2.%1"/>
+      <w:lvlJc w:val="left"/>
+      <w:pPr>
+        <w:ind w:left="1429" w:hanging="360"/>
+      </w:pPr>
+      <w:rPr>
+        <w:rFonts w:hint="default"/>
+      </w:rPr>
+    </w:lvl>
+    <w:lvl w:ilvl="1" w:tplc="04190019" w:tentative="1">
+      <w:start w:val="1"/>
+      <w:numFmt w:val="lowerLetter"/>
+      <w:lvlText w:val="%2."/>
+      <w:lvlJc w:val="left"/>
+      <w:pPr>
+        <w:ind w:left="2149" w:hanging="360"/>
+      </w:pPr>
+    </w:lvl>
+    <w:lvl w:ilvl="2" w:tplc="0419001B" w:tentative="1">
+      <w:start w:val="1"/>
+      <w:numFmt w:val="lowerRoman"/>
+      <w:lvlText w:val="%3."/>
+      <w:lvlJc w:val="right"/>
+      <w:pPr>
+        <w:ind w:left="2869" w:hanging="180"/>
+      </w:pPr>
+    </w:lvl>
+    <w:lvl w:ilvl="3" w:tplc="0419000F" w:tentative="1">
+      <w:start w:val="1"/>
+      <w:numFmt w:val="decimal"/>
+      <w:lvlText w:val="%4."/>
+      <w:lvlJc w:val="left"/>
+      <w:pPr>
+        <w:ind w:left="3589" w:hanging="360"/>
+      </w:pPr>
+    </w:lvl>
+    <w:lvl w:ilvl="4" w:tplc="04190019" w:tentative="1">
+      <w:start w:val="1"/>
+      <w:numFmt w:val="lowerLetter"/>
+      <w:lvlText w:val="%5."/>
+      <w:lvlJc w:val="left"/>
+      <w:pPr>
+        <w:ind w:left="4309" w:hanging="360"/>
+      </w:pPr>
+    </w:lvl>
+    <w:lvl w:ilvl="5" w:tplc="0419001B" w:tentative="1">
+      <w:start w:val="1"/>
+      <w:numFmt w:val="lowerRoman"/>
+      <w:lvlText w:val="%6."/>
+      <w:lvlJc w:val="right"/>
+      <w:pPr>
+        <w:ind w:left="5029" w:hanging="180"/>
+      </w:pPr>
+    </w:lvl>
+    <w:lvl w:ilvl="6" w:tplc="0419000F" w:tentative="1">
+      <w:start w:val="1"/>
+      <w:numFmt w:val="decimal"/>
+      <w:lvlText w:val="%7."/>
+      <w:lvlJc w:val="left"/>
+      <w:pPr>
+        <w:ind w:left="5749" w:hanging="360"/>
+      </w:pPr>
+    </w:lvl>
+    <w:lvl w:ilvl="7" w:tplc="04190019" w:tentative="1">
+      <w:start w:val="1"/>
+      <w:numFmt w:val="lowerLetter"/>
+      <w:lvlText w:val="%8."/>
+      <w:lvlJc w:val="left"/>
+      <w:pPr>
+        <w:ind w:left="6469" w:hanging="360"/>
+      </w:pPr>
+    </w:lvl>
+    <w:lvl w:ilvl="8" w:tplc="0419001B" w:tentative="1">
+      <w:start w:val="1"/>
+      <w:numFmt w:val="lowerRoman"/>
+      <w:lvlText w:val="%9."/>
+      <w:lvlJc w:val="right"/>
+      <w:pPr>
+        <w:ind w:left="7189" w:hanging="180"/>
+      </w:pPr>
+    </w:lvl>
+  </w:abstractNum>
+  <w:abstractNum w:abstractNumId="20" w15:restartNumberingAfterBreak="0">
     <w:nsid w:val="7FBC2E7D"/>
     <w:multiLevelType w:val="hybridMultilevel"/>
     <w:tmpl w:val="4B30D856"/>
@@ -8519,25 +9195,25 @@
     <w:abstractNumId w:val="5"/>
   </w:num>
   <w:num w:numId="4" w16cid:durableId="2070879149">
-    <w:abstractNumId w:val="14"/>
+    <w:abstractNumId w:val="15"/>
   </w:num>
   <w:num w:numId="5" w16cid:durableId="1109547911">
-    <w:abstractNumId w:val="16"/>
+    <w:abstractNumId w:val="17"/>
   </w:num>
   <w:num w:numId="6" w16cid:durableId="1284769007">
-    <w:abstractNumId w:val="17"/>
+    <w:abstractNumId w:val="18"/>
   </w:num>
   <w:num w:numId="7" w16cid:durableId="780565645">
-    <w:abstractNumId w:val="15"/>
+    <w:abstractNumId w:val="16"/>
   </w:num>
   <w:num w:numId="8" w16cid:durableId="775054236">
     <w:abstractNumId w:val="4"/>
   </w:num>
   <w:num w:numId="9" w16cid:durableId="550769759">
-    <w:abstractNumId w:val="10"/>
+    <w:abstractNumId w:val="11"/>
   </w:num>
   <w:num w:numId="10" w16cid:durableId="355010631">
-    <w:abstractNumId w:val="11"/>
+    <w:abstractNumId w:val="12"/>
   </w:num>
   <w:num w:numId="11" w16cid:durableId="952250147">
     <w:abstractNumId w:val="2"/>
@@ -8546,13 +9222,13 @@
     <w:abstractNumId w:val="0"/>
   </w:num>
   <w:num w:numId="13" w16cid:durableId="1333488402">
-    <w:abstractNumId w:val="13"/>
+    <w:abstractNumId w:val="14"/>
   </w:num>
   <w:num w:numId="14" w16cid:durableId="1292440363">
-    <w:abstractNumId w:val="18"/>
+    <w:abstractNumId w:val="20"/>
   </w:num>
   <w:num w:numId="15" w16cid:durableId="867914959">
-    <w:abstractNumId w:val="12"/>
+    <w:abstractNumId w:val="13"/>
   </w:num>
   <w:num w:numId="16" w16cid:durableId="420949872">
     <w:abstractNumId w:val="3"/>
@@ -8565,6 +9241,12 @@
   </w:num>
   <w:num w:numId="19" w16cid:durableId="1330673282">
     <w:abstractNumId w:val="9"/>
+  </w:num>
+  <w:num w:numId="20" w16cid:durableId="1622881363">
+    <w:abstractNumId w:val="19"/>
+  </w:num>
+  <w:num w:numId="21" w16cid:durableId="1133593084">
+    <w:abstractNumId w:val="10"/>
   </w:num>
   <w:numIdMacAtCleanup w:val="11"/>
 </w:numbering>

</xml_diff>